<commit_message>
changes in pdf files
</commit_message>
<xml_diff>
--- a/pdf/SEP Project Proposal.docx
+++ b/pdf/SEP Project Proposal.docx
@@ -1044,7 +1044,19 @@
               <w:rPr>
                 <w:rFonts w:ascii="Segoe UI" w:eastAsia="Segoe UI" w:hAnsi="Segoe UI" w:cs="Segoe UI"/>
               </w:rPr>
-              <w:t>Python (Flask)</w:t>
+              <w:t>Python (</w:t>
+            </w:r>
+            <w:r>
+              <w:rPr>
+                <w:rFonts w:ascii="Segoe UI" w:eastAsia="Segoe UI" w:hAnsi="Segoe UI" w:cs="Segoe UI"/>
+              </w:rPr>
+              <w:t>Django</w:t>
+            </w:r>
+            <w:r>
+              <w:rPr>
+                <w:rFonts w:ascii="Segoe UI" w:eastAsia="Segoe UI" w:hAnsi="Segoe UI" w:cs="Segoe UI"/>
+              </w:rPr>
+              <w:t>)</w:t>
             </w:r>
           </w:p>
           <w:p>
@@ -5456,6 +5468,23 @@
 </file>
 
 <file path=customXml/item1.xml><?xml version="1.0" encoding="utf-8"?>
+<p:properties xmlns:p="http://schemas.microsoft.com/office/2006/metadata/properties" xmlns:xsi="http://www.w3.org/2001/XMLSchema-instance" xmlns:pc="http://schemas.microsoft.com/office/infopath/2007/PartnerControls">
+  <documentManagement>
+    <_activity xmlns="be68bc91-2402-4d29-a5b3-368489942f93" xsi:nil="true"/>
+  </documentManagement>
+</p:properties>
+</file>
+
+<file path=customXml/item2.xml><?xml version="1.0" encoding="utf-8"?>
+<?mso-contentType ?>
+<FormTemplates xmlns="http://schemas.microsoft.com/sharepoint/v3/contenttype/forms">
+  <Display>DocumentLibraryForm</Display>
+  <Edit>DocumentLibraryForm</Edit>
+  <New>DocumentLibraryForm</New>
+</FormTemplates>
+</file>
+
+<file path=customXml/item3.xml><?xml version="1.0" encoding="utf-8"?>
 <ct:contentTypeSchema xmlns:ct="http://schemas.microsoft.com/office/2006/metadata/contentType" xmlns:ma="http://schemas.microsoft.com/office/2006/metadata/properties/metaAttributes" ct:_="" ma:_="" ma:contentTypeName="Document" ma:contentTypeID="0x010100F1F5599FD87D0F47AA14BD61FE66242C" ma:contentTypeVersion="6" ma:contentTypeDescription="Create a new document." ma:contentTypeScope="" ma:versionID="3f8c11242e9b92ac31e1de342a276d8e">
   <xsd:schema xmlns:xsd="http://www.w3.org/2001/XMLSchema" xmlns:xs="http://www.w3.org/2001/XMLSchema" xmlns:p="http://schemas.microsoft.com/office/2006/metadata/properties" xmlns:ns3="be68bc91-2402-4d29-a5b3-368489942f93" xmlns:ns4="5e3a6f59-6e70-4fe5-93c0-5f87ec3e2085" targetNamespace="http://schemas.microsoft.com/office/2006/metadata/properties" ma:root="true" ma:fieldsID="874e7e5929ca6e6912a991af6ccdae31" ns3:_="" ns4:_="">
     <xsd:import namespace="be68bc91-2402-4d29-a5b3-368489942f93"/>
@@ -5616,24 +5645,25 @@
 </ct:contentTypeSchema>
 </file>
 
-<file path=customXml/item2.xml><?xml version="1.0" encoding="utf-8"?>
-<?mso-contentType ?>
-<FormTemplates xmlns="http://schemas.microsoft.com/sharepoint/v3/contenttype/forms">
-  <Display>DocumentLibraryForm</Display>
-  <Edit>DocumentLibraryForm</Edit>
-  <New>DocumentLibraryForm</New>
-</FormTemplates>
+<file path=customXml/itemProps1.xml><?xml version="1.0" encoding="utf-8"?>
+<ds:datastoreItem xmlns:ds="http://schemas.openxmlformats.org/officeDocument/2006/customXml" ds:itemID="{4C482166-13EE-4B1A-B4B8-1855DCEF9919}">
+  <ds:schemaRefs>
+    <ds:schemaRef ds:uri="http://schemas.microsoft.com/office/2006/metadata/properties"/>
+    <ds:schemaRef ds:uri="http://schemas.microsoft.com/office/infopath/2007/PartnerControls"/>
+    <ds:schemaRef ds:uri="be68bc91-2402-4d29-a5b3-368489942f93"/>
+  </ds:schemaRefs>
+</ds:datastoreItem>
 </file>
 
-<file path=customXml/item3.xml><?xml version="1.0" encoding="utf-8"?>
-<p:properties xmlns:p="http://schemas.microsoft.com/office/2006/metadata/properties" xmlns:xsi="http://www.w3.org/2001/XMLSchema-instance" xmlns:pc="http://schemas.microsoft.com/office/infopath/2007/PartnerControls">
-  <documentManagement>
-    <_activity xmlns="be68bc91-2402-4d29-a5b3-368489942f93" xsi:nil="true"/>
-  </documentManagement>
-</p:properties>
+<file path=customXml/itemProps2.xml><?xml version="1.0" encoding="utf-8"?>
+<ds:datastoreItem xmlns:ds="http://schemas.openxmlformats.org/officeDocument/2006/customXml" ds:itemID="{7F1BE733-496F-4589-8AC5-4524442FCC71}">
+  <ds:schemaRefs>
+    <ds:schemaRef ds:uri="http://schemas.microsoft.com/sharepoint/v3/contenttype/forms"/>
+  </ds:schemaRefs>
+</ds:datastoreItem>
 </file>
 
-<file path=customXml/itemProps1.xml><?xml version="1.0" encoding="utf-8"?>
+<file path=customXml/itemProps3.xml><?xml version="1.0" encoding="utf-8"?>
 <ds:datastoreItem xmlns:ds="http://schemas.openxmlformats.org/officeDocument/2006/customXml" ds:itemID="{6C073175-096C-4C13-AE8C-1A34FA864264}">
   <ds:schemaRefs>
     <ds:schemaRef ds:uri="http://schemas.microsoft.com/office/2006/metadata/contentType"/>
@@ -5650,22 +5680,4 @@
     <ds:schemaRef ds:uri="http://schemas.microsoft.com/internal/obd"/>
   </ds:schemaRefs>
 </ds:datastoreItem>
-</file>
-
-<file path=customXml/itemProps2.xml><?xml version="1.0" encoding="utf-8"?>
-<ds:datastoreItem xmlns:ds="http://schemas.openxmlformats.org/officeDocument/2006/customXml" ds:itemID="{7F1BE733-496F-4589-8AC5-4524442FCC71}">
-  <ds:schemaRefs>
-    <ds:schemaRef ds:uri="http://schemas.microsoft.com/sharepoint/v3/contenttype/forms"/>
-  </ds:schemaRefs>
-</ds:datastoreItem>
-</file>
-
-<file path=customXml/itemProps3.xml><?xml version="1.0" encoding="utf-8"?>
-<ds:datastoreItem xmlns:ds="http://schemas.openxmlformats.org/officeDocument/2006/customXml" ds:itemID="{4C482166-13EE-4B1A-B4B8-1855DCEF9919}">
-  <ds:schemaRefs>
-    <ds:schemaRef ds:uri="http://schemas.microsoft.com/office/2006/metadata/properties"/>
-    <ds:schemaRef ds:uri="http://schemas.microsoft.com/office/infopath/2007/PartnerControls"/>
-    <ds:schemaRef ds:uri="be68bc91-2402-4d29-a5b3-368489942f93"/>
-  </ds:schemaRefs>
-</ds:datastoreItem>
 </file>
</xml_diff>